<commit_message>
jenkins and Helm chart added
</commit_message>
<xml_diff>
--- a/Streaming App.docx
+++ b/Streaming App.docx
@@ -66,25 +66,27 @@
     <w:p>
       <w:pPr>
         <w:pStyle w:val="ListParagraph"/>
+      </w:pPr>
+    </w:p>
+    <w:p>
+      <w:pPr>
+        <w:pStyle w:val="ListParagraph"/>
         <w:numPr>
           <w:ilvl w:val="0"/>
           <w:numId w:val="1"/>
         </w:numPr>
       </w:pPr>
       <w:r>
-        <w:t xml:space="preserve">Amazon ECR </w:t>
+        <w:t>Docker Builds:</w:t>
       </w:r>
     </w:p>
     <w:p>
-      <w:pPr>
-        <w:pStyle w:val="ListParagraph"/>
-      </w:pPr>
       <w:r>
         <w:drawing>
-          <wp:inline distT="0" distB="0" distL="0" distR="0" wp14:anchorId="4C43B7A9" wp14:editId="40C5FC4B">
-            <wp:extent cx="5731510" cy="1856740"/>
-            <wp:effectExtent l="0" t="0" r="2540" b="0"/>
-            <wp:docPr id="1904808041" name="Picture 1"/>
+          <wp:inline distT="0" distB="0" distL="0" distR="0" wp14:anchorId="2B570078" wp14:editId="3C7E1132">
+            <wp:extent cx="5731510" cy="1517650"/>
+            <wp:effectExtent l="0" t="0" r="2540" b="6350"/>
+            <wp:docPr id="244152460" name="Picture 1"/>
             <wp:cNvGraphicFramePr>
               <a:graphicFrameLocks xmlns:a="http://schemas.openxmlformats.org/drawingml/2006/main" noChangeAspect="1"/>
             </wp:cNvGraphicFramePr>
@@ -92,7 +94,7 @@
               <a:graphicData uri="http://schemas.openxmlformats.org/drawingml/2006/picture">
                 <pic:pic xmlns:pic="http://schemas.openxmlformats.org/drawingml/2006/picture">
                   <pic:nvPicPr>
-                    <pic:cNvPr id="1904808041" name=""/>
+                    <pic:cNvPr id="244152460" name=""/>
                     <pic:cNvPicPr/>
                   </pic:nvPicPr>
                   <pic:blipFill>
@@ -104,7 +106,7 @@
                   <pic:spPr>
                     <a:xfrm>
                       <a:off x="0" y="0"/>
-                      <a:ext cx="5731510" cy="1856740"/>
+                      <a:ext cx="5731510" cy="1517650"/>
                     </a:xfrm>
                     <a:prstGeom prst="rect">
                       <a:avLst/>
@@ -126,15 +128,49 @@
         </w:numPr>
       </w:pPr>
       <w:r>
-        <w:t>C:\Users\arunkumar\Documents\Assignments\StreamingApp&gt;docker build -t streaming-</w:t>
+        <w:t>Docker Compose</w:t>
       </w:r>
-      <w:proofErr w:type="gramStart"/>
+    </w:p>
+    <w:p>
+      <w:pPr>
+        <w:pStyle w:val="ListParagraph"/>
+      </w:pPr>
       <w:r>
-        <w:t>backend .</w:t>
-      </w:r>
-      <w:proofErr w:type="gramEnd"/>
-      <w:r>
-        <w:t>/backend</w:t>
+        <w:drawing>
+          <wp:inline distT="0" distB="0" distL="0" distR="0" wp14:anchorId="6B79B991" wp14:editId="55D67DB9">
+            <wp:extent cx="5731510" cy="1268095"/>
+            <wp:effectExtent l="0" t="0" r="2540" b="8255"/>
+            <wp:docPr id="670370030" name="Picture 1"/>
+            <wp:cNvGraphicFramePr>
+              <a:graphicFrameLocks xmlns:a="http://schemas.openxmlformats.org/drawingml/2006/main" noChangeAspect="1"/>
+            </wp:cNvGraphicFramePr>
+            <a:graphic xmlns:a="http://schemas.openxmlformats.org/drawingml/2006/main">
+              <a:graphicData uri="http://schemas.openxmlformats.org/drawingml/2006/picture">
+                <pic:pic xmlns:pic="http://schemas.openxmlformats.org/drawingml/2006/picture">
+                  <pic:nvPicPr>
+                    <pic:cNvPr id="670370030" name=""/>
+                    <pic:cNvPicPr/>
+                  </pic:nvPicPr>
+                  <pic:blipFill>
+                    <a:blip r:embed="rId7"/>
+                    <a:stretch>
+                      <a:fillRect/>
+                    </a:stretch>
+                  </pic:blipFill>
+                  <pic:spPr>
+                    <a:xfrm>
+                      <a:off x="0" y="0"/>
+                      <a:ext cx="5731510" cy="1268095"/>
+                    </a:xfrm>
+                    <a:prstGeom prst="rect">
+                      <a:avLst/>
+                    </a:prstGeom>
+                  </pic:spPr>
+                </pic:pic>
+              </a:graphicData>
+            </a:graphic>
+          </wp:inline>
+        </w:drawing>
       </w:r>
     </w:p>
     <w:p>
@@ -146,13 +182,51 @@
         </w:numPr>
       </w:pPr>
       <w:r>
-        <w:t xml:space="preserve">[+] Building 0.3s (1/1) FINISHED                      </w:t>
+        <w:t>Amazon ECR</w:t>
       </w:r>
-      <w:proofErr w:type="spellStart"/>
+    </w:p>
+    <w:p>
+      <w:pPr>
+        <w:pStyle w:val="ListParagraph"/>
+      </w:pPr>
       <w:r>
-        <w:t>docker:desktop-linux</w:t>
+        <w:lastRenderedPageBreak/>
+        <w:drawing>
+          <wp:inline distT="0" distB="0" distL="0" distR="0" wp14:anchorId="35C409BF" wp14:editId="74993A58">
+            <wp:extent cx="5731510" cy="2181225"/>
+            <wp:effectExtent l="0" t="0" r="2540" b="9525"/>
+            <wp:docPr id="1579472440" name="Picture 1"/>
+            <wp:cNvGraphicFramePr>
+              <a:graphicFrameLocks xmlns:a="http://schemas.openxmlformats.org/drawingml/2006/main" noChangeAspect="1"/>
+            </wp:cNvGraphicFramePr>
+            <a:graphic xmlns:a="http://schemas.openxmlformats.org/drawingml/2006/main">
+              <a:graphicData uri="http://schemas.openxmlformats.org/drawingml/2006/picture">
+                <pic:pic xmlns:pic="http://schemas.openxmlformats.org/drawingml/2006/picture">
+                  <pic:nvPicPr>
+                    <pic:cNvPr id="1579472440" name=""/>
+                    <pic:cNvPicPr/>
+                  </pic:nvPicPr>
+                  <pic:blipFill>
+                    <a:blip r:embed="rId8"/>
+                    <a:stretch>
+                      <a:fillRect/>
+                    </a:stretch>
+                  </pic:blipFill>
+                  <pic:spPr>
+                    <a:xfrm>
+                      <a:off x="0" y="0"/>
+                      <a:ext cx="5731510" cy="2181225"/>
+                    </a:xfrm>
+                    <a:prstGeom prst="rect">
+                      <a:avLst/>
+                    </a:prstGeom>
+                  </pic:spPr>
+                </pic:pic>
+              </a:graphicData>
+            </a:graphic>
+          </wp:inline>
+        </w:drawing>
       </w:r>
-      <w:proofErr w:type="spellEnd"/>
     </w:p>
     <w:p>
       <w:pPr>
@@ -163,886 +237,218 @@
         </w:numPr>
       </w:pPr>
       <w:r>
-        <w:t xml:space="preserve"> =&gt; [internal] load build definition from </w:t>
-      </w:r>
-      <w:proofErr w:type="spellStart"/>
-      <w:r>
-        <w:t>Dockerfile</w:t>
-      </w:r>
-      <w:proofErr w:type="spellEnd"/>
-      <w:r>
-        <w:t xml:space="preserve">                  0.1s</w:t>
+        <w:t xml:space="preserve"> Images Pulled to ECR</w:t>
       </w:r>
     </w:p>
     <w:p>
       <w:pPr>
         <w:pStyle w:val="ListParagraph"/>
-        <w:numPr>
-          <w:ilvl w:val="0"/>
-          <w:numId w:val="1"/>
-        </w:numPr>
       </w:pPr>
       <w:r>
-        <w:t xml:space="preserve"> =&gt; =&gt; transferring </w:t>
-      </w:r>
-      <w:proofErr w:type="spellStart"/>
-      <w:r>
-        <w:t>dockerfile</w:t>
-      </w:r>
-      <w:proofErr w:type="spellEnd"/>
-      <w:r>
-        <w:t>: 2B                                    0.0s</w:t>
+        <w:drawing>
+          <wp:inline distT="0" distB="0" distL="0" distR="0" wp14:anchorId="13B4B179" wp14:editId="7C128B8F">
+            <wp:extent cx="5731510" cy="2613025"/>
+            <wp:effectExtent l="0" t="0" r="2540" b="0"/>
+            <wp:docPr id="2006893974" name="Picture 1"/>
+            <wp:cNvGraphicFramePr>
+              <a:graphicFrameLocks xmlns:a="http://schemas.openxmlformats.org/drawingml/2006/main" noChangeAspect="1"/>
+            </wp:cNvGraphicFramePr>
+            <a:graphic xmlns:a="http://schemas.openxmlformats.org/drawingml/2006/main">
+              <a:graphicData uri="http://schemas.openxmlformats.org/drawingml/2006/picture">
+                <pic:pic xmlns:pic="http://schemas.openxmlformats.org/drawingml/2006/picture">
+                  <pic:nvPicPr>
+                    <pic:cNvPr id="2006893974" name=""/>
+                    <pic:cNvPicPr/>
+                  </pic:nvPicPr>
+                  <pic:blipFill>
+                    <a:blip r:embed="rId9"/>
+                    <a:stretch>
+                      <a:fillRect/>
+                    </a:stretch>
+                  </pic:blipFill>
+                  <pic:spPr>
+                    <a:xfrm>
+                      <a:off x="0" y="0"/>
+                      <a:ext cx="5731510" cy="2613025"/>
+                    </a:xfrm>
+                    <a:prstGeom prst="rect">
+                      <a:avLst/>
+                    </a:prstGeom>
+                  </pic:spPr>
+                </pic:pic>
+              </a:graphicData>
+            </a:graphic>
+          </wp:inline>
+        </w:drawing>
       </w:r>
     </w:p>
     <w:p>
       <w:pPr>
         <w:pStyle w:val="ListParagraph"/>
-        <w:numPr>
-          <w:ilvl w:val="0"/>
-          <w:numId w:val="1"/>
-        </w:numPr>
       </w:pPr>
       <w:r>
-        <w:t xml:space="preserve">ERROR: failed to build: failed to solve: failed to read </w:t>
-      </w:r>
-      <w:proofErr w:type="spellStart"/>
-      <w:r>
-        <w:t>dockerfile</w:t>
-      </w:r>
-      <w:proofErr w:type="spellEnd"/>
-      <w:r>
-        <w:t xml:space="preserve">: open </w:t>
-      </w:r>
-      <w:proofErr w:type="spellStart"/>
-      <w:r>
-        <w:t>Dockerfile</w:t>
-      </w:r>
-      <w:proofErr w:type="spellEnd"/>
-      <w:r>
-        <w:t>: no such file or directory</w:t>
+        <w:drawing>
+          <wp:inline distT="0" distB="0" distL="0" distR="0" wp14:anchorId="3878E985" wp14:editId="5CCE1A6A">
+            <wp:extent cx="5731510" cy="2710180"/>
+            <wp:effectExtent l="0" t="0" r="2540" b="0"/>
+            <wp:docPr id="1796962253" name="Picture 1"/>
+            <wp:cNvGraphicFramePr>
+              <a:graphicFrameLocks xmlns:a="http://schemas.openxmlformats.org/drawingml/2006/main" noChangeAspect="1"/>
+            </wp:cNvGraphicFramePr>
+            <a:graphic xmlns:a="http://schemas.openxmlformats.org/drawingml/2006/main">
+              <a:graphicData uri="http://schemas.openxmlformats.org/drawingml/2006/picture">
+                <pic:pic xmlns:pic="http://schemas.openxmlformats.org/drawingml/2006/picture">
+                  <pic:nvPicPr>
+                    <pic:cNvPr id="1796962253" name=""/>
+                    <pic:cNvPicPr/>
+                  </pic:nvPicPr>
+                  <pic:blipFill>
+                    <a:blip r:embed="rId10"/>
+                    <a:stretch>
+                      <a:fillRect/>
+                    </a:stretch>
+                  </pic:blipFill>
+                  <pic:spPr>
+                    <a:xfrm>
+                      <a:off x="0" y="0"/>
+                      <a:ext cx="5731510" cy="2710180"/>
+                    </a:xfrm>
+                    <a:prstGeom prst="rect">
+                      <a:avLst/>
+                    </a:prstGeom>
+                  </pic:spPr>
+                </pic:pic>
+              </a:graphicData>
+            </a:graphic>
+          </wp:inline>
+        </w:drawing>
       </w:r>
     </w:p>
     <w:p>
       <w:pPr>
         <w:pStyle w:val="ListParagraph"/>
-        <w:numPr>
-          <w:ilvl w:val="0"/>
-          <w:numId w:val="1"/>
-        </w:numPr>
-      </w:pPr>
-    </w:p>
-    <w:p>
-      <w:pPr>
-        <w:pStyle w:val="ListParagraph"/>
-        <w:numPr>
-          <w:ilvl w:val="0"/>
-          <w:numId w:val="1"/>
-        </w:numPr>
       </w:pPr>
       <w:r>
-        <w:t>View build details: docker-desktop://dashboard/build/desktop-linux/desktop-linux/2do08x0pcz8prhocaaf6sfngp</w:t>
+        <w:lastRenderedPageBreak/>
+        <w:drawing>
+          <wp:inline distT="0" distB="0" distL="0" distR="0" wp14:anchorId="56F4980F" wp14:editId="78F6EF18">
+            <wp:extent cx="5731510" cy="2779395"/>
+            <wp:effectExtent l="0" t="0" r="2540" b="1905"/>
+            <wp:docPr id="60138799" name="Picture 1"/>
+            <wp:cNvGraphicFramePr>
+              <a:graphicFrameLocks xmlns:a="http://schemas.openxmlformats.org/drawingml/2006/main" noChangeAspect="1"/>
+            </wp:cNvGraphicFramePr>
+            <a:graphic xmlns:a="http://schemas.openxmlformats.org/drawingml/2006/main">
+              <a:graphicData uri="http://schemas.openxmlformats.org/drawingml/2006/picture">
+                <pic:pic xmlns:pic="http://schemas.openxmlformats.org/drawingml/2006/picture">
+                  <pic:nvPicPr>
+                    <pic:cNvPr id="60138799" name=""/>
+                    <pic:cNvPicPr/>
+                  </pic:nvPicPr>
+                  <pic:blipFill>
+                    <a:blip r:embed="rId11"/>
+                    <a:stretch>
+                      <a:fillRect/>
+                    </a:stretch>
+                  </pic:blipFill>
+                  <pic:spPr>
+                    <a:xfrm>
+                      <a:off x="0" y="0"/>
+                      <a:ext cx="5731510" cy="2779395"/>
+                    </a:xfrm>
+                    <a:prstGeom prst="rect">
+                      <a:avLst/>
+                    </a:prstGeom>
+                  </pic:spPr>
+                </pic:pic>
+              </a:graphicData>
+            </a:graphic>
+          </wp:inline>
+        </w:drawing>
       </w:r>
     </w:p>
     <w:p>
       <w:pPr>
         <w:pStyle w:val="ListParagraph"/>
-        <w:numPr>
-          <w:ilvl w:val="0"/>
-          <w:numId w:val="1"/>
-        </w:numPr>
       </w:pPr>
       <w:r>
-        <w:t>C:\Users\arunkumar\Documents\Assignments\StreamingApp&gt;docker build -t streaming-</w:t>
-      </w:r>
-      <w:proofErr w:type="gramStart"/>
-      <w:r>
-        <w:t>frontend .</w:t>
-      </w:r>
-      <w:proofErr w:type="gramEnd"/>
-      <w:r>
-        <w:t>/frontend</w:t>
+        <w:drawing>
+          <wp:inline distT="0" distB="0" distL="0" distR="0" wp14:anchorId="333F708D" wp14:editId="5BF8F857">
+            <wp:extent cx="5731510" cy="2766060"/>
+            <wp:effectExtent l="0" t="0" r="2540" b="0"/>
+            <wp:docPr id="1264381067" name="Picture 1"/>
+            <wp:cNvGraphicFramePr>
+              <a:graphicFrameLocks xmlns:a="http://schemas.openxmlformats.org/drawingml/2006/main" noChangeAspect="1"/>
+            </wp:cNvGraphicFramePr>
+            <a:graphic xmlns:a="http://schemas.openxmlformats.org/drawingml/2006/main">
+              <a:graphicData uri="http://schemas.openxmlformats.org/drawingml/2006/picture">
+                <pic:pic xmlns:pic="http://schemas.openxmlformats.org/drawingml/2006/picture">
+                  <pic:nvPicPr>
+                    <pic:cNvPr id="1264381067" name=""/>
+                    <pic:cNvPicPr/>
+                  </pic:nvPicPr>
+                  <pic:blipFill>
+                    <a:blip r:embed="rId12"/>
+                    <a:stretch>
+                      <a:fillRect/>
+                    </a:stretch>
+                  </pic:blipFill>
+                  <pic:spPr>
+                    <a:xfrm>
+                      <a:off x="0" y="0"/>
+                      <a:ext cx="5731510" cy="2766060"/>
+                    </a:xfrm>
+                    <a:prstGeom prst="rect">
+                      <a:avLst/>
+                    </a:prstGeom>
+                  </pic:spPr>
+                </pic:pic>
+              </a:graphicData>
+            </a:graphic>
+          </wp:inline>
+        </w:drawing>
       </w:r>
     </w:p>
     <w:p>
       <w:pPr>
         <w:pStyle w:val="ListParagraph"/>
-        <w:numPr>
-          <w:ilvl w:val="0"/>
-          <w:numId w:val="1"/>
-        </w:numPr>
       </w:pPr>
       <w:r>
-        <w:t xml:space="preserve">[+] Building 216.7s (16/16) FINISHED                                                                            </w:t>
-      </w:r>
-      <w:proofErr w:type="spellStart"/>
-      <w:r>
-        <w:t>docker:desktop-linux</w:t>
-      </w:r>
-      <w:proofErr w:type="spellEnd"/>
-    </w:p>
-    <w:p>
-      <w:pPr>
-        <w:pStyle w:val="ListParagraph"/>
-        <w:numPr>
-          <w:ilvl w:val="0"/>
-          <w:numId w:val="1"/>
-        </w:numPr>
-      </w:pPr>
-      <w:r>
-        <w:lastRenderedPageBreak/>
-        <w:t xml:space="preserve"> =&gt; [internal] load build definition from </w:t>
-      </w:r>
-      <w:proofErr w:type="spellStart"/>
-      <w:r>
-        <w:t>Dockerfile</w:t>
-      </w:r>
-      <w:proofErr w:type="spellEnd"/>
-      <w:r>
-        <w:t xml:space="preserve">                                                                            0.0s</w:t>
-      </w:r>
-    </w:p>
-    <w:p>
-      <w:pPr>
-        <w:pStyle w:val="ListParagraph"/>
-        <w:numPr>
-          <w:ilvl w:val="0"/>
-          <w:numId w:val="1"/>
-        </w:numPr>
-      </w:pPr>
-      <w:r>
-        <w:t xml:space="preserve"> =&gt; =&gt; transferring </w:t>
-      </w:r>
-      <w:proofErr w:type="spellStart"/>
-      <w:r>
-        <w:t>dockerfile</w:t>
-      </w:r>
-      <w:proofErr w:type="spellEnd"/>
-      <w:r>
-        <w:t>: 846B                                                                                            0.0s</w:t>
-      </w:r>
-    </w:p>
-    <w:p>
-      <w:pPr>
-        <w:pStyle w:val="ListParagraph"/>
-        <w:numPr>
-          <w:ilvl w:val="0"/>
-          <w:numId w:val="1"/>
-        </w:numPr>
-      </w:pPr>
-      <w:r>
-        <w:t xml:space="preserve"> =&gt; [internal] load metadata for docker.io/library/nginx:1.27-alpine                                                            3.7s</w:t>
-      </w:r>
-    </w:p>
-    <w:p>
-      <w:pPr>
-        <w:pStyle w:val="ListParagraph"/>
-        <w:numPr>
-          <w:ilvl w:val="0"/>
-          <w:numId w:val="1"/>
-        </w:numPr>
-      </w:pPr>
-      <w:r>
-        <w:t xml:space="preserve"> =&gt; [internal] load metadata for docker.io/library/node:18-alpine                                                               2.1s</w:t>
-      </w:r>
-    </w:p>
-    <w:p>
-      <w:pPr>
-        <w:pStyle w:val="ListParagraph"/>
-        <w:numPr>
-          <w:ilvl w:val="0"/>
-          <w:numId w:val="1"/>
-        </w:numPr>
-      </w:pPr>
-      <w:r>
-        <w:t xml:space="preserve"> =&gt; [auth] library/</w:t>
-      </w:r>
-      <w:proofErr w:type="spellStart"/>
-      <w:proofErr w:type="gramStart"/>
-      <w:r>
-        <w:t>node:pull</w:t>
-      </w:r>
-      <w:proofErr w:type="spellEnd"/>
-      <w:proofErr w:type="gramEnd"/>
-      <w:r>
-        <w:t xml:space="preserve"> token for registry-1.docker.io                                                                     0.0s</w:t>
-      </w:r>
-    </w:p>
-    <w:p>
-      <w:pPr>
-        <w:pStyle w:val="ListParagraph"/>
-        <w:numPr>
-          <w:ilvl w:val="0"/>
-          <w:numId w:val="1"/>
-        </w:numPr>
-      </w:pPr>
-      <w:r>
-        <w:t xml:space="preserve"> =&gt; [auth] library/</w:t>
-      </w:r>
-      <w:proofErr w:type="spellStart"/>
-      <w:proofErr w:type="gramStart"/>
-      <w:r>
-        <w:t>nginx:pull</w:t>
-      </w:r>
-      <w:proofErr w:type="spellEnd"/>
-      <w:proofErr w:type="gramEnd"/>
-      <w:r>
-        <w:t xml:space="preserve"> token for registry-1.docker.io                                                                    0.0s</w:t>
-      </w:r>
-    </w:p>
-    <w:p>
-      <w:pPr>
-        <w:pStyle w:val="ListParagraph"/>
-        <w:numPr>
-          <w:ilvl w:val="0"/>
-          <w:numId w:val="1"/>
-        </w:numPr>
-      </w:pPr>
-      <w:r>
-        <w:t xml:space="preserve"> =&gt; [internal] </w:t>
-      </w:r>
-      <w:proofErr w:type="gramStart"/>
-      <w:r>
-        <w:t>load .</w:t>
-      </w:r>
-      <w:proofErr w:type="spellStart"/>
-      <w:r>
-        <w:t>dockerignore</w:t>
-      </w:r>
-      <w:proofErr w:type="spellEnd"/>
-      <w:proofErr w:type="gramEnd"/>
-      <w:r>
-        <w:t xml:space="preserve">                                                                                               0.1s</w:t>
-      </w:r>
-    </w:p>
-    <w:p>
-      <w:pPr>
-        <w:pStyle w:val="ListParagraph"/>
-        <w:numPr>
-          <w:ilvl w:val="0"/>
-          <w:numId w:val="1"/>
-        </w:numPr>
-      </w:pPr>
-      <w:r>
-        <w:t xml:space="preserve"> =&gt; =&gt; transferring context: 93B                                                                                                0.0s</w:t>
-      </w:r>
-    </w:p>
-    <w:p>
-      <w:pPr>
-        <w:pStyle w:val="ListParagraph"/>
-        <w:numPr>
-          <w:ilvl w:val="0"/>
-          <w:numId w:val="1"/>
-        </w:numPr>
-      </w:pPr>
-      <w:r>
-        <w:t xml:space="preserve"> =&gt; [build 1/6] FROM docker.io/library/node:18-alpine@sha256:8d6421d663b4c28fd3ebc498332f249011d118945588d0a35cb9bc4b8ca09d9e   0.1s</w:t>
-      </w:r>
-    </w:p>
-    <w:p>
-      <w:pPr>
-        <w:pStyle w:val="ListParagraph"/>
-        <w:numPr>
-          <w:ilvl w:val="0"/>
-          <w:numId w:val="1"/>
-        </w:numPr>
-      </w:pPr>
-      <w:r>
-        <w:t xml:space="preserve"> =&gt; =&gt; resolve docker.io/library/node:18-alpine@sha256:8d6421d663b4c28fd3ebc498332f249011d118945588d0a35cb9bc4b8ca09d9e         0.1s</w:t>
-      </w:r>
-    </w:p>
-    <w:p>
-      <w:pPr>
-        <w:pStyle w:val="ListParagraph"/>
-        <w:numPr>
-          <w:ilvl w:val="0"/>
-          <w:numId w:val="1"/>
-        </w:numPr>
-      </w:pPr>
-      <w:r>
-        <w:t xml:space="preserve"> =&gt; [production 1/2] FROM docker.io/library/nginx:1.27-alpine@sha256:65645c7bb6a0661892a8b03b89d0743208a18dd2f3f17a54ef4b76fb</w:t>
-      </w:r>
-      <w:proofErr w:type="gramStart"/>
-      <w:r>
-        <w:t>8  5.8s</w:t>
-      </w:r>
-      <w:proofErr w:type="gramEnd"/>
-    </w:p>
-    <w:p>
-      <w:pPr>
-        <w:pStyle w:val="ListParagraph"/>
-        <w:numPr>
-          <w:ilvl w:val="0"/>
-          <w:numId w:val="1"/>
-        </w:numPr>
-      </w:pPr>
-      <w:r>
-        <w:t xml:space="preserve"> =&gt; =&gt; resolve docker.io/library/nginx:1.27-alpine@sha256:65645c7bb6a0661892a8b03b89d0743208a18dd2f3f17a54ef4b76fb8e2f2a10      0.1s</w:t>
-      </w:r>
-    </w:p>
-    <w:p>
-      <w:pPr>
-        <w:pStyle w:val="ListParagraph"/>
-        <w:numPr>
-          <w:ilvl w:val="0"/>
-          <w:numId w:val="1"/>
-        </w:numPr>
-      </w:pPr>
-      <w:r>
-        <w:t xml:space="preserve"> =&gt; =&gt; sha256:34a64644b756511a2e217f0508e11d1a572085d66cd6dc9a555a082ad49a3102 1.40kB / 1.40kB                                  0.7s</w:t>
-      </w:r>
-    </w:p>
-    <w:p>
-      <w:pPr>
-        <w:pStyle w:val="ListParagraph"/>
-        <w:numPr>
-          <w:ilvl w:val="0"/>
-          <w:numId w:val="1"/>
-        </w:numPr>
-      </w:pPr>
-      <w:r>
-        <w:t xml:space="preserve"> =&gt; =&gt; sha256:39c2ddfd6010082a4a646e7ca44e95aca9bf3eaebc00f17f7ccc2954004f2a7d 15.52MB / 15.52MB                                4.7s</w:t>
-      </w:r>
-    </w:p>
-    <w:p>
-      <w:pPr>
-        <w:pStyle w:val="ListParagraph"/>
-        <w:numPr>
-          <w:ilvl w:val="0"/>
-          <w:numId w:val="1"/>
-        </w:numPr>
-      </w:pPr>
-      <w:r>
-        <w:t xml:space="preserve"> =&gt; =&gt; sha256:197eb75867ef4fcecd4724f17b0972ab0489436860a594a9445f8eaff8155053 1.21kB / 1.21kB                                  1.3s</w:t>
-      </w:r>
-    </w:p>
-    <w:p>
-      <w:pPr>
-        <w:pStyle w:val="ListParagraph"/>
-        <w:numPr>
-          <w:ilvl w:val="0"/>
-          <w:numId w:val="1"/>
-        </w:numPr>
-      </w:pPr>
-      <w:r>
-        <w:t xml:space="preserve"> =&gt; =&gt; sha256:81bd8ed7ec6789b0cb7f1b47ee731c522f6dba83201ec73cd6bca1350f582948 402B / 402B                                      1.4s</w:t>
-      </w:r>
-    </w:p>
-    <w:p>
-      <w:pPr>
-        <w:pStyle w:val="ListParagraph"/>
-        <w:numPr>
-          <w:ilvl w:val="0"/>
-          <w:numId w:val="1"/>
-        </w:numPr>
-      </w:pPr>
-      <w:r>
-        <w:lastRenderedPageBreak/>
-        <w:t xml:space="preserve"> =&gt; =&gt; sha</w:t>
-      </w:r>
-      <w:proofErr w:type="gramStart"/>
-      <w:r>
-        <w:t>256:d</w:t>
-      </w:r>
-      <w:proofErr w:type="gramEnd"/>
-      <w:r>
-        <w:t>7e5070240863957ebb0b5a44a5729963c3462666baa2947d00628cb5f2d5773 955B / 955B                                      0.8s</w:t>
-      </w:r>
-    </w:p>
-    <w:p>
-      <w:pPr>
-        <w:pStyle w:val="ListParagraph"/>
-        <w:numPr>
-          <w:ilvl w:val="0"/>
-          <w:numId w:val="1"/>
-        </w:numPr>
-      </w:pPr>
-      <w:r>
-        <w:t xml:space="preserve"> =&gt; =&gt; sha256:61ca4f733c802afd9e05a32f0de0361b6d713b8b53292dc15fb093229f648674 1.79MB / 1.79MB                                  1.2s</w:t>
-      </w:r>
-    </w:p>
-    <w:p>
-      <w:pPr>
-        <w:pStyle w:val="ListParagraph"/>
-        <w:numPr>
-          <w:ilvl w:val="0"/>
-          <w:numId w:val="1"/>
-        </w:numPr>
-      </w:pPr>
-      <w:r>
-        <w:t xml:space="preserve"> =&gt; =&gt; sha</w:t>
-      </w:r>
-      <w:proofErr w:type="gramStart"/>
-      <w:r>
-        <w:t>256:b</w:t>
-      </w:r>
-      <w:proofErr w:type="gramEnd"/>
-      <w:r>
-        <w:t>464cfdf2a6319875aeb27359ec549790ce14d8214fcb16ef915e4530e5ed235 0B / 629B                                      211.0s</w:t>
-      </w:r>
-    </w:p>
-    <w:p>
-      <w:pPr>
-        <w:pStyle w:val="ListParagraph"/>
-        <w:numPr>
-          <w:ilvl w:val="0"/>
-          <w:numId w:val="1"/>
-        </w:numPr>
-      </w:pPr>
-      <w:r>
-        <w:t xml:space="preserve"> =&gt; =&gt; extracting sha256:61ca4f733c802afd9e05a32f0de0361b6d713b8b53292dc15fb093229f648674                                       0.4s</w:t>
-      </w:r>
-    </w:p>
-    <w:p>
-      <w:pPr>
-        <w:pStyle w:val="ListParagraph"/>
-        <w:numPr>
-          <w:ilvl w:val="0"/>
-          <w:numId w:val="1"/>
-        </w:numPr>
-      </w:pPr>
-      <w:r>
-        <w:t xml:space="preserve"> =&gt; =&gt; extracting sha</w:t>
-      </w:r>
-      <w:proofErr w:type="gramStart"/>
-      <w:r>
-        <w:t>256:b</w:t>
-      </w:r>
-      <w:proofErr w:type="gramEnd"/>
-      <w:r>
-        <w:t>464cfdf2a6319875aeb27359ec549790ce14d8214fcb16ef915e4530e5ed235                                       0.0s</w:t>
-      </w:r>
-    </w:p>
-    <w:p>
-      <w:pPr>
-        <w:pStyle w:val="ListParagraph"/>
-        <w:numPr>
-          <w:ilvl w:val="0"/>
-          <w:numId w:val="1"/>
-        </w:numPr>
-      </w:pPr>
-      <w:r>
-        <w:t xml:space="preserve"> =&gt; =&gt; extracting sha</w:t>
-      </w:r>
-      <w:proofErr w:type="gramStart"/>
-      <w:r>
-        <w:t>256:d</w:t>
-      </w:r>
-      <w:proofErr w:type="gramEnd"/>
-      <w:r>
-        <w:t>7e5070240863957ebb0b5a44a5729963c3462666baa2947d00628cb5f2d5773                                       0.0s</w:t>
-      </w:r>
-    </w:p>
-    <w:p>
-      <w:pPr>
-        <w:pStyle w:val="ListParagraph"/>
-        <w:numPr>
-          <w:ilvl w:val="0"/>
-          <w:numId w:val="1"/>
-        </w:numPr>
-      </w:pPr>
-      <w:r>
-        <w:t xml:space="preserve"> =&gt; =&gt; extracting sha256:81bd8ed7ec6789b0cb7f1b47ee731c522f6dba83201ec73cd6bca1350f582948                                       0.0s</w:t>
-      </w:r>
-    </w:p>
-    <w:p>
-      <w:pPr>
-        <w:pStyle w:val="ListParagraph"/>
-        <w:numPr>
-          <w:ilvl w:val="0"/>
-          <w:numId w:val="1"/>
-        </w:numPr>
-      </w:pPr>
-      <w:r>
-        <w:t xml:space="preserve"> =&gt; =&gt; extracting sha256:197eb75867ef4fcecd4724f17b0972ab0489436860a594a9445f8eaff8155053                                       0.0s</w:t>
-      </w:r>
-    </w:p>
-    <w:p>
-      <w:pPr>
-        <w:pStyle w:val="ListParagraph"/>
-        <w:numPr>
-          <w:ilvl w:val="0"/>
-          <w:numId w:val="1"/>
-        </w:numPr>
-      </w:pPr>
-      <w:r>
-        <w:t xml:space="preserve"> =&gt; =&gt; extracting sha256:34a64644b756511a2e217f0508e11d1a572085d66cd6dc9a555a082ad49a3102                                       0.0s</w:t>
-      </w:r>
-    </w:p>
-    <w:p>
-      <w:pPr>
-        <w:pStyle w:val="ListParagraph"/>
-        <w:numPr>
-          <w:ilvl w:val="0"/>
-          <w:numId w:val="1"/>
-        </w:numPr>
-      </w:pPr>
-      <w:r>
-        <w:t xml:space="preserve"> =&gt; =&gt; extracting sha256:39c2ddfd6010082a4a646e7ca44e95aca9bf3eaebc00f17f7ccc2954004f2a7d                                       0.7s</w:t>
-      </w:r>
-    </w:p>
-    <w:p>
-      <w:pPr>
-        <w:pStyle w:val="ListParagraph"/>
-        <w:numPr>
-          <w:ilvl w:val="0"/>
-          <w:numId w:val="1"/>
-        </w:numPr>
-      </w:pPr>
-      <w:r>
-        <w:t xml:space="preserve"> =&gt; [internal] load build context                                                                                               0.3s</w:t>
-      </w:r>
-    </w:p>
-    <w:p>
-      <w:pPr>
-        <w:pStyle w:val="ListParagraph"/>
-        <w:numPr>
-          <w:ilvl w:val="0"/>
-          <w:numId w:val="1"/>
-        </w:numPr>
-      </w:pPr>
-      <w:r>
-        <w:t xml:space="preserve"> =&gt; =&gt; transferring context: 947.16kB                                                                                           0.2s</w:t>
-      </w:r>
-    </w:p>
-    <w:p>
-      <w:pPr>
-        <w:pStyle w:val="ListParagraph"/>
-        <w:numPr>
-          <w:ilvl w:val="0"/>
-          <w:numId w:val="1"/>
-        </w:numPr>
-      </w:pPr>
-      <w:r>
-        <w:t xml:space="preserve"> =&gt; CACHED [build 2/6] WORKDIR /app                                                                                             0.0s</w:t>
-      </w:r>
-    </w:p>
-    <w:p>
-      <w:pPr>
-        <w:pStyle w:val="ListParagraph"/>
-        <w:numPr>
-          <w:ilvl w:val="0"/>
-          <w:numId w:val="1"/>
-        </w:numPr>
-      </w:pPr>
-      <w:r>
-        <w:t xml:space="preserve"> =&gt; [build 3/6] COPY package</w:t>
-      </w:r>
-      <w:proofErr w:type="gramStart"/>
-      <w:r>
-        <w:t>*.</w:t>
-      </w:r>
-      <w:proofErr w:type="spellStart"/>
-      <w:r>
-        <w:t>json</w:t>
-      </w:r>
-      <w:proofErr w:type="spellEnd"/>
-      <w:r>
-        <w:t xml:space="preserve"> ./</w:t>
-      </w:r>
-      <w:proofErr w:type="gramEnd"/>
-      <w:r>
-        <w:t xml:space="preserve">                                                                                           0.1s</w:t>
-      </w:r>
-    </w:p>
-    <w:p>
-      <w:pPr>
-        <w:pStyle w:val="ListParagraph"/>
-        <w:numPr>
-          <w:ilvl w:val="0"/>
-          <w:numId w:val="1"/>
-        </w:numPr>
-      </w:pPr>
-      <w:r>
-        <w:t xml:space="preserve"> =&gt; [build 4/6] RUN </w:t>
-      </w:r>
-      <w:proofErr w:type="spellStart"/>
-      <w:r>
-        <w:t>npm</w:t>
-      </w:r>
-      <w:proofErr w:type="spellEnd"/>
-      <w:r>
-        <w:t xml:space="preserve"> install                                                                                                82.0s</w:t>
-      </w:r>
-    </w:p>
-    <w:p>
-      <w:pPr>
-        <w:pStyle w:val="ListParagraph"/>
-        <w:numPr>
-          <w:ilvl w:val="0"/>
-          <w:numId w:val="1"/>
-        </w:numPr>
-      </w:pPr>
-      <w:r>
-        <w:t xml:space="preserve"> =&gt; [build 5/6] </w:t>
-      </w:r>
-      <w:proofErr w:type="gramStart"/>
-      <w:r>
-        <w:t>COPY .</w:t>
-      </w:r>
-      <w:proofErr w:type="gramEnd"/>
-      <w:r>
-        <w:t xml:space="preserve"> .                                                                                                        1.5s</w:t>
-      </w:r>
-    </w:p>
-    <w:p>
-      <w:pPr>
-        <w:pStyle w:val="ListParagraph"/>
-        <w:numPr>
-          <w:ilvl w:val="0"/>
-          <w:numId w:val="1"/>
-        </w:numPr>
-      </w:pPr>
-      <w:r>
-        <w:lastRenderedPageBreak/>
-        <w:t xml:space="preserve"> =&gt; [build 6/6] RUN </w:t>
-      </w:r>
-      <w:proofErr w:type="spellStart"/>
-      <w:r>
-        <w:t>npm</w:t>
-      </w:r>
-      <w:proofErr w:type="spellEnd"/>
-      <w:r>
-        <w:t xml:space="preserve"> run build                                                                                             124.5s</w:t>
-      </w:r>
-    </w:p>
-    <w:p>
-      <w:pPr>
-        <w:pStyle w:val="ListParagraph"/>
-        <w:numPr>
-          <w:ilvl w:val="0"/>
-          <w:numId w:val="1"/>
-        </w:numPr>
-      </w:pPr>
-      <w:r>
-        <w:t xml:space="preserve"> =&gt; [production 2/2] COPY --from=build /app/build /</w:t>
-      </w:r>
-      <w:proofErr w:type="spellStart"/>
-      <w:r>
-        <w:t>usr</w:t>
-      </w:r>
-      <w:proofErr w:type="spellEnd"/>
-      <w:r>
-        <w:t>/share/nginx/html                                                         0.2s</w:t>
-      </w:r>
-    </w:p>
-    <w:p>
-      <w:pPr>
-        <w:pStyle w:val="ListParagraph"/>
-        <w:numPr>
-          <w:ilvl w:val="0"/>
-          <w:numId w:val="1"/>
-        </w:numPr>
-      </w:pPr>
-      <w:r>
-        <w:t xml:space="preserve"> =&gt; exporting to image                                                                                                          1.6s</w:t>
-      </w:r>
-    </w:p>
-    <w:p>
-      <w:pPr>
-        <w:pStyle w:val="ListParagraph"/>
-        <w:numPr>
-          <w:ilvl w:val="0"/>
-          <w:numId w:val="1"/>
-        </w:numPr>
-      </w:pPr>
-      <w:r>
-        <w:t xml:space="preserve"> =&gt; =&gt; exporting layers                                                                                                         0.7s</w:t>
-      </w:r>
-    </w:p>
-    <w:p>
-      <w:pPr>
-        <w:pStyle w:val="ListParagraph"/>
-        <w:numPr>
-          <w:ilvl w:val="0"/>
-          <w:numId w:val="1"/>
-        </w:numPr>
-      </w:pPr>
-      <w:r>
-        <w:t xml:space="preserve"> =&gt; =&gt; exporting manifest sha256:8554dd2ddc0caf1ab411553e1c62928db11b85e5d225b3c8a41f2bc4373d5c6e                               0.1s</w:t>
-      </w:r>
-    </w:p>
-    <w:p>
-      <w:pPr>
-        <w:pStyle w:val="ListParagraph"/>
-        <w:numPr>
-          <w:ilvl w:val="0"/>
-          <w:numId w:val="1"/>
-        </w:numPr>
-      </w:pPr>
-      <w:r>
-        <w:t xml:space="preserve"> =&gt; =&gt; exporting config sha</w:t>
-      </w:r>
-      <w:proofErr w:type="gramStart"/>
-      <w:r>
-        <w:t>256:aefb</w:t>
-      </w:r>
-      <w:proofErr w:type="gramEnd"/>
-      <w:r>
-        <w:t>711e5dd5847705d3aaa4e042159ae16169117428ec687caa9c112df12d7e                                 0.1s</w:t>
-      </w:r>
-    </w:p>
-    <w:p>
-      <w:pPr>
-        <w:pStyle w:val="ListParagraph"/>
-        <w:numPr>
-          <w:ilvl w:val="0"/>
-          <w:numId w:val="1"/>
-        </w:numPr>
-      </w:pPr>
-      <w:r>
-        <w:t xml:space="preserve"> =&gt; =&gt; exporting attestation manifest sha256:32c915ffecb41d244fc24af8fae69ce5eb26e9f23023ec3589df8e0966b38815                   0.2s</w:t>
-      </w:r>
-    </w:p>
-    <w:p>
-      <w:pPr>
-        <w:pStyle w:val="ListParagraph"/>
-        <w:numPr>
-          <w:ilvl w:val="0"/>
-          <w:numId w:val="1"/>
-        </w:numPr>
-      </w:pPr>
-      <w:r>
-        <w:t xml:space="preserve"> =&gt; =&gt; exporting manifest list sha</w:t>
-      </w:r>
-      <w:proofErr w:type="gramStart"/>
-      <w:r>
-        <w:t>256:e</w:t>
-      </w:r>
-      <w:proofErr w:type="gramEnd"/>
-      <w:r>
-        <w:t>9b6ec6bac3fc663c4d74f8289535e0b6e80a1c225cb97ced5faabafa5834cea                          0.1s</w:t>
-      </w:r>
-    </w:p>
-    <w:p>
-      <w:pPr>
-        <w:pStyle w:val="ListParagraph"/>
-        <w:numPr>
-          <w:ilvl w:val="0"/>
-          <w:numId w:val="1"/>
-        </w:numPr>
-      </w:pPr>
-      <w:r>
-        <w:t xml:space="preserve"> =&gt; =&gt; naming to docker.io/library/</w:t>
-      </w:r>
-      <w:proofErr w:type="spellStart"/>
-      <w:r>
-        <w:t>streaming-</w:t>
-      </w:r>
-      <w:proofErr w:type="gramStart"/>
-      <w:r>
-        <w:t>frontend:latest</w:t>
-      </w:r>
-      <w:proofErr w:type="spellEnd"/>
-      <w:proofErr w:type="gramEnd"/>
-      <w:r>
-        <w:t xml:space="preserve">                                                                    0.2s</w:t>
-      </w:r>
-    </w:p>
-    <w:p>
-      <w:pPr>
-        <w:pStyle w:val="ListParagraph"/>
-        <w:numPr>
-          <w:ilvl w:val="0"/>
-          <w:numId w:val="1"/>
-        </w:numPr>
-      </w:pPr>
-      <w:r>
-        <w:t xml:space="preserve"> =&gt; =&gt; unpacking to docker.io/library/</w:t>
-      </w:r>
-      <w:proofErr w:type="spellStart"/>
-      <w:r>
-        <w:t>streaming-</w:t>
-      </w:r>
-      <w:proofErr w:type="gramStart"/>
-      <w:r>
-        <w:t>frontend:latest</w:t>
-      </w:r>
-      <w:proofErr w:type="spellEnd"/>
-      <w:proofErr w:type="gramEnd"/>
-      <w:r>
-        <w:t xml:space="preserve">                                                                 0.2s</w:t>
-      </w:r>
-    </w:p>
-    <w:p>
-      <w:pPr>
-        <w:pStyle w:val="ListParagraph"/>
-        <w:numPr>
-          <w:ilvl w:val="0"/>
-          <w:numId w:val="1"/>
-        </w:numPr>
-      </w:pPr>
-    </w:p>
-    <w:p>
-      <w:pPr>
-        <w:pStyle w:val="ListParagraph"/>
-        <w:numPr>
-          <w:ilvl w:val="0"/>
-          <w:numId w:val="1"/>
-        </w:numPr>
-      </w:pPr>
-      <w:r>
-        <w:t xml:space="preserve"> 2 warnings found (use docker --debug to expand):</w:t>
-      </w:r>
-    </w:p>
-    <w:p>
-      <w:pPr>
-        <w:pStyle w:val="ListParagraph"/>
-        <w:numPr>
-          <w:ilvl w:val="0"/>
-          <w:numId w:val="1"/>
-        </w:numPr>
-      </w:pPr>
-      <w:r>
-        <w:t xml:space="preserve"> - </w:t>
-      </w:r>
-      <w:proofErr w:type="spellStart"/>
-      <w:r>
-        <w:t>SecretsUsedInArgOrEnv</w:t>
-      </w:r>
-      <w:proofErr w:type="spellEnd"/>
-      <w:r>
-        <w:t>: Do not use ARG or ENV instructions for sensitive data (ARG "REACT_APP_AUTH_API_URL") (line 10)</w:t>
-      </w:r>
-    </w:p>
-    <w:p>
-      <w:pPr>
-        <w:pStyle w:val="ListParagraph"/>
-        <w:numPr>
-          <w:ilvl w:val="0"/>
-          <w:numId w:val="1"/>
-        </w:numPr>
-      </w:pPr>
-      <w:r>
-        <w:t xml:space="preserve"> - </w:t>
-      </w:r>
-      <w:proofErr w:type="spellStart"/>
-      <w:r>
-        <w:t>SecretsUsedInArgOrEnv</w:t>
-      </w:r>
-      <w:proofErr w:type="spellEnd"/>
-      <w:r>
-        <w:t>: Do not use ARG or ENV instructions for sensitive data (ENV "REACT_APP_AUTH_API_URL") (line 17)</w:t>
-      </w:r>
-    </w:p>
-    <w:p>
-      <w:pPr>
-        <w:pStyle w:val="ListParagraph"/>
-        <w:numPr>
-          <w:ilvl w:val="0"/>
-          <w:numId w:val="1"/>
-        </w:numPr>
-      </w:pPr>
-    </w:p>
-    <w:p>
-      <w:pPr>
-        <w:pStyle w:val="ListParagraph"/>
-        <w:numPr>
-          <w:ilvl w:val="0"/>
-          <w:numId w:val="1"/>
-        </w:numPr>
-      </w:pPr>
-      <w:r>
-        <w:t>View build details: docker-desktop://dashboard/build/desktop-linux/desktop-linux/7ve64kt6fudfq93jfxl77781b</w:t>
+        <w:drawing>
+          <wp:inline distT="0" distB="0" distL="0" distR="0" wp14:anchorId="23EBD418" wp14:editId="09BF5072">
+            <wp:extent cx="5731510" cy="2772410"/>
+            <wp:effectExtent l="0" t="0" r="2540" b="8890"/>
+            <wp:docPr id="50602368" name="Picture 1"/>
+            <wp:cNvGraphicFramePr>
+              <a:graphicFrameLocks xmlns:a="http://schemas.openxmlformats.org/drawingml/2006/main" noChangeAspect="1"/>
+            </wp:cNvGraphicFramePr>
+            <a:graphic xmlns:a="http://schemas.openxmlformats.org/drawingml/2006/main">
+              <a:graphicData uri="http://schemas.openxmlformats.org/drawingml/2006/picture">
+                <pic:pic xmlns:pic="http://schemas.openxmlformats.org/drawingml/2006/picture">
+                  <pic:nvPicPr>
+                    <pic:cNvPr id="50602368" name=""/>
+                    <pic:cNvPicPr/>
+                  </pic:nvPicPr>
+                  <pic:blipFill>
+                    <a:blip r:embed="rId13"/>
+                    <a:stretch>
+                      <a:fillRect/>
+                    </a:stretch>
+                  </pic:blipFill>
+                  <pic:spPr>
+                    <a:xfrm>
+                      <a:off x="0" y="0"/>
+                      <a:ext cx="5731510" cy="2772410"/>
+                    </a:xfrm>
+                    <a:prstGeom prst="rect">
+                      <a:avLst/>
+                    </a:prstGeom>
+                  </pic:spPr>
+                </pic:pic>
+              </a:graphicData>
+            </a:graphic>
+          </wp:inline>
+        </w:drawing>
       </w:r>
     </w:p>
     <w:sectPr>

</xml_diff>